<commit_message>
almost finished high poly. zbrush soon
</commit_message>
<xml_diff>
--- a/Sem6/Blender/Отчеты/1_Комисарик_МА_ИКБО-20-23.docx
+++ b/Sem6/Blender/Отчеты/1_Комисарик_МА_ИКБО-20-23.docx
@@ -5,170 +5,170 @@
     <w:p>
       <w:pPr>
         <w:pStyle w:val="12"/>
+      </w:pPr>
+      <w:r>
+        <w:t>ПРАКТИКА 1</w:t>
+      </w:r>
+    </w:p>
+    <w:p>
+      <w:pPr>
+        <w:pStyle w:val="a4"/>
+      </w:pPr>
+      <w:r>
+        <w:t xml:space="preserve">Тема: </w:t>
+      </w:r>
+      <w:r>
+        <w:t>Создание трехмерной модели по теме: «Реактивный ранец»</w:t>
+      </w:r>
+    </w:p>
+    <w:p>
+      <w:pPr>
+        <w:pStyle w:val="a4"/>
+        <w:rPr>
+          <w:b/>
+          <w:bCs/>
+        </w:rPr>
+      </w:pPr>
+      <w:r>
+        <w:rPr>
+          <w:b/>
+          <w:bCs/>
+        </w:rPr>
+        <w:t>1. Тип модели</w:t>
+      </w:r>
+    </w:p>
+    <w:p>
+      <w:pPr>
+        <w:pStyle w:val="a4"/>
+      </w:pPr>
+      <w:r>
+        <w:rPr>
+          <w:b/>
+          <w:bCs/>
+        </w:rPr>
+        <w:t>Динамичная</w:t>
+      </w:r>
+      <w:r>
+        <w:t> (объект экипировки персонажа с подвижными элементами: соплами, ремнями и стрелкой манометра).</w:t>
+      </w:r>
+    </w:p>
+    <w:p>
+      <w:pPr>
+        <w:pStyle w:val="a4"/>
+        <w:rPr>
+          <w:b/>
+          <w:bCs/>
+        </w:rPr>
+      </w:pPr>
+      <w:r>
+        <w:rPr>
+          <w:b/>
+          <w:bCs/>
+        </w:rPr>
+        <w:t>2. Краткая вводная информация по создаваемому объекту</w:t>
+      </w:r>
+    </w:p>
+    <w:p>
+      <w:pPr>
+        <w:pStyle w:val="a4"/>
+      </w:pPr>
+      <w:r>
+        <w:t xml:space="preserve">Реактивный ранец, собранный из подручных средств в индустриально-деревенском сеттинге. Основные элементы: старый огнетушитель, два кислородных баллона, обрезки труб, армированный скотч и кожаные ремни. Визуальный стиль опирается на стилистику Team </w:t>
+      </w:r>
+      <w:proofErr w:type="spellStart"/>
+      <w:r>
+        <w:t>Fortress</w:t>
+      </w:r>
+      <w:proofErr w:type="spellEnd"/>
+      <w:r>
+        <w:t xml:space="preserve"> 2: гиперболизированные формы, лаконичные детали, выразительный силуэт.</w:t>
+      </w:r>
+    </w:p>
+    <w:p>
+      <w:pPr>
+        <w:pStyle w:val="a4"/>
+        <w:rPr>
+          <w:b/>
+          <w:bCs/>
+        </w:rPr>
+      </w:pPr>
+      <w:r>
+        <w:rPr>
+          <w:b/>
+          <w:bCs/>
+        </w:rPr>
+        <w:t>3. Среда нахождения объекта в игре</w:t>
+      </w:r>
+    </w:p>
+    <w:p>
+      <w:pPr>
+        <w:pStyle w:val="a4"/>
+      </w:pPr>
+      <w:r>
+        <w:t>Запыленные индустриальные зоны, карьеры, пустынные заводы. Объект должен иметь следы активной эксплуатации: потертости краски до металла, пятна копоти у сопел, небольшие очаги ржавчины и осевшую рыжую пыль.</w:t>
+      </w:r>
+    </w:p>
+    <w:p>
+      <w:pPr>
+        <w:pStyle w:val="a4"/>
+        <w:rPr>
+          <w:b/>
+          <w:bCs/>
+        </w:rPr>
+      </w:pPr>
+      <w:r>
+        <w:rPr>
+          <w:b/>
+          <w:bCs/>
+        </w:rPr>
+        <w:t>4. История объекта</w:t>
+      </w:r>
+    </w:p>
+    <w:p>
+      <w:pPr>
+        <w:pStyle w:val="a4"/>
+      </w:pPr>
+      <w:r>
+        <w:t xml:space="preserve">Инженер из </w:t>
+      </w:r>
+      <w:r>
         <w:rPr>
           <w:lang w:val="en-US"/>
         </w:rPr>
-      </w:pPr>
-      <w:r>
-        <w:t>ПРАКТИКА 1</w:t>
-      </w:r>
-    </w:p>
-    <w:p>
-      <w:pPr>
-        <w:pStyle w:val="a4"/>
-      </w:pPr>
-      <w:r>
-        <w:t xml:space="preserve">Тема: </w:t>
-      </w:r>
-      <w:r>
-        <w:t>Создание трехмерной модели по теме: «Реактивный ранец»</w:t>
-      </w:r>
-    </w:p>
-    <w:p>
-      <w:pPr>
-        <w:pStyle w:val="a4"/>
-        <w:rPr>
-          <w:b/>
-          <w:bCs/>
-        </w:rPr>
-      </w:pPr>
-      <w:r>
-        <w:rPr>
-          <w:b/>
-          <w:bCs/>
-        </w:rPr>
-        <w:t>1. Тип модели</w:t>
-      </w:r>
-    </w:p>
-    <w:p>
-      <w:pPr>
-        <w:pStyle w:val="a4"/>
-      </w:pPr>
-      <w:r>
-        <w:rPr>
-          <w:b/>
-          <w:bCs/>
-        </w:rPr>
-        <w:t>Динамичная</w:t>
-      </w:r>
-      <w:r>
-        <w:t> (объект экипировки персонажа с подвижными элементами: соплами, ремнями и стрелкой манометра).</w:t>
-      </w:r>
-    </w:p>
-    <w:p>
-      <w:pPr>
-        <w:pStyle w:val="a4"/>
-        <w:rPr>
-          <w:b/>
-          <w:bCs/>
-        </w:rPr>
-      </w:pPr>
-      <w:r>
-        <w:rPr>
-          <w:b/>
-          <w:bCs/>
-        </w:rPr>
-        <w:t>2. Краткая вводная информация по создаваемому объекту</w:t>
-      </w:r>
-    </w:p>
-    <w:p>
-      <w:pPr>
-        <w:pStyle w:val="a4"/>
-      </w:pPr>
-      <w:r>
-        <w:t xml:space="preserve">Реактивный ранец, собранный из подручных средств в индустриально-деревенском сеттинге. Основные элементы: старый огнетушитель, два кислородных баллона, обрезки труб, армированный скотч и кожаные ремни. Визуальный стиль опирается на стилистику Team </w:t>
-      </w:r>
-      <w:proofErr w:type="spellStart"/>
-      <w:r>
-        <w:t>Fortress</w:t>
-      </w:r>
-      <w:proofErr w:type="spellEnd"/>
-      <w:r>
-        <w:t xml:space="preserve"> 2: гиперболизированные формы, лаконичные детали, выразительный силуэт.</w:t>
-      </w:r>
-    </w:p>
-    <w:p>
-      <w:pPr>
-        <w:pStyle w:val="a4"/>
-        <w:rPr>
-          <w:b/>
-          <w:bCs/>
-        </w:rPr>
-      </w:pPr>
-      <w:r>
-        <w:rPr>
-          <w:b/>
-          <w:bCs/>
-        </w:rPr>
-        <w:t>3. Среда нахождения объекта в игре</w:t>
-      </w:r>
-    </w:p>
-    <w:p>
-      <w:pPr>
-        <w:pStyle w:val="a4"/>
-      </w:pPr>
-      <w:r>
-        <w:t>Запыленные индустриальные зоны, карьеры, пустынные заводы. Объект должен иметь следы активной эксплуатации: потертости краски до металла, пятна копоти у сопел, небольшие очаги ржавчины и осевшую рыжую пыль.</w:t>
-      </w:r>
-    </w:p>
-    <w:p>
-      <w:pPr>
-        <w:pStyle w:val="a4"/>
-        <w:rPr>
-          <w:b/>
-          <w:bCs/>
-        </w:rPr>
-      </w:pPr>
-      <w:r>
-        <w:rPr>
-          <w:b/>
-          <w:bCs/>
-        </w:rPr>
-        <w:t>4. История объекта</w:t>
-      </w:r>
-    </w:p>
-    <w:p>
-      <w:pPr>
-        <w:pStyle w:val="a4"/>
-      </w:pPr>
-      <w:r>
-        <w:t xml:space="preserve">Инженер из </w:t>
+        <w:t>T</w:t>
       </w:r>
       <w:r>
         <w:rPr>
           <w:lang w:val="en-US"/>
         </w:rPr>
-        <w:t>T</w:t>
+        <w:t>eam</w:t>
+      </w:r>
+      <w:r>
+        <w:t xml:space="preserve"> </w:t>
       </w:r>
       <w:r>
         <w:rPr>
           <w:lang w:val="en-US"/>
         </w:rPr>
-        <w:t>eam</w:t>
+        <w:t>F</w:t>
+      </w:r>
+      <w:r>
+        <w:rPr>
+          <w:lang w:val="en-US"/>
+        </w:rPr>
+        <w:t>ortress</w:t>
       </w:r>
       <w:r>
         <w:t xml:space="preserve"> </w:t>
       </w:r>
       <w:r>
-        <w:rPr>
-          <w:lang w:val="en-US"/>
-        </w:rPr>
-        <w:t>F</w:t>
-      </w:r>
-      <w:r>
-        <w:rPr>
-          <w:lang w:val="en-US"/>
-        </w:rPr>
-        <w:t>ortress</w:t>
-      </w:r>
-      <w:r>
-        <w:t xml:space="preserve"> </w:t>
-      </w:r>
-      <w:r>
         <w:t xml:space="preserve">2 </w:t>
       </w:r>
       <w:r>
         <w:t xml:space="preserve">собрал этот реактивный ранец </w:t>
+      </w:r>
+      <w:r>
+        <w:t xml:space="preserve">из подручных материалов </w:t>
       </w:r>
       <w:r>
         <w:t>за пару часов</w:t>
@@ -361,6 +361,9 @@
         </w:rPr>
       </w:pPr>
       <w:r>
+        <w:rPr>
+          <w:noProof/>
+        </w:rPr>
         <w:drawing>
           <wp:inline distT="0" distB="0" distL="0" distR="0" wp14:anchorId="74723159" wp14:editId="37C0E054">
             <wp:extent cx="3709281" cy="3699803"/>
@@ -410,6 +413,7 @@
       </w:pPr>
       <w:r>
         <w:rPr>
+          <w:noProof/>
           <w:lang w:val="en-US"/>
         </w:rPr>
         <w:drawing>
@@ -460,6 +464,9 @@
         <w:pStyle w:val="aa"/>
       </w:pPr>
       <w:r>
+        <w:rPr>
+          <w:noProof/>
+        </w:rPr>
         <w:lastRenderedPageBreak/>
         <w:drawing>
           <wp:inline distT="0" distB="0" distL="0" distR="0" wp14:anchorId="57132646" wp14:editId="10EB61D9">
@@ -503,6 +510,9 @@
         <w:pStyle w:val="aa"/>
       </w:pPr>
       <w:r>
+        <w:rPr>
+          <w:noProof/>
+        </w:rPr>
         <w:drawing>
           <wp:inline distT="0" distB="0" distL="0" distR="0" wp14:anchorId="511B12CF" wp14:editId="7A426493">
             <wp:extent cx="4593436" cy="4867422"/>
@@ -738,13 +748,7 @@
         </w:numPr>
       </w:pPr>
       <w:r>
-        <w:t xml:space="preserve">Frame — </w:t>
-      </w:r>
-      <w:r>
-        <w:t>Р</w:t>
-      </w:r>
-      <w:r>
-        <w:t>ама.</w:t>
+        <w:t>Frame — Рама.</w:t>
       </w:r>
     </w:p>
     <w:p>
@@ -761,13 +765,7 @@
       </w:r>
       <w:proofErr w:type="spellEnd"/>
       <w:r>
-        <w:t xml:space="preserve">/R — </w:t>
-      </w:r>
-      <w:r>
-        <w:t>Б</w:t>
-      </w:r>
-      <w:r>
-        <w:t>аллоны.</w:t>
+        <w:t>/R — Баллоны.</w:t>
       </w:r>
     </w:p>
     <w:p>
@@ -784,13 +782,7 @@
       </w:r>
       <w:proofErr w:type="spellEnd"/>
       <w:r>
-        <w:t>_</w:t>
-      </w:r>
-      <w:r>
-        <w:t xml:space="preserve"> </w:t>
-      </w:r>
-      <w:r>
-        <w:t>L/R — Сопла.</w:t>
+        <w:t>_ L/R — Сопла.</w:t>
       </w:r>
     </w:p>
     <w:p>
@@ -5603,6 +5595,7 @@
   <w:style w:type="character" w:default="1" w:styleId="a1">
     <w:name w:val="Default Paragraph Font"/>
     <w:uiPriority w:val="1"/>
+    <w:semiHidden/>
     <w:unhideWhenUsed/>
   </w:style>
   <w:style w:type="table" w:default="1" w:styleId="a2">

</xml_diff>